<commit_message>
feat: rewrite Section 4.2 - remove Table 7 ref, expand to full cited comparison
- Removed 'Table 7 contrasts AETHEL with existing frameworks' sentence
- Expanded to 4 full paragraphs with 15+ in-text citations from the 43-paper literature review
- Calibration: Guo et al. 2017, Niculescu-Mizil & Caruana 2005
- Explainability: Lundberg 2017, Adadi 2018, Arrieta 2020, Doshi-Velez 2017
- Clinical utility: Steyerberg 2010, Van Calster 2024, Venn 2008
- External validation: Collins 2024, Riley 2021, Royston 2013
- Trustworthy AI: Lekadir/FUTURE-AI 2022, Ning/FUTURE-AI 2024
- Reporting: TRIPOD+AI 2024, DECIDE-AI 2022
</commit_message>
<xml_diff>
--- a/AETHEL_Manuscript_Final_v2.docx
+++ b/AETHEL_Manuscript_Final_v2.docx
@@ -2852,16 +2852,21 @@
         <w:pStyle w:val="BodyText"/>
       </w:pPr>
       <w:r>
-        <w:t>Prior calibration research (e.g., Guo et al., 2017) assumes that validation and test datasets are drawn from the same underlying distribution (IID). AETHEL extends this work by evaluating calibration under explicit domain shift. Furthermore, while biostatisticians advocate for Decision Curve Analysis (</w:t>
+        <w:t xml:space="preserve">Several lines of prior work inform but do not subsume the AETHEL contribution. Guo et al. (2017) established Expected Calibration Error (ECE) and temperature scaling as the standard for post-hoc probability correction; however, their evaluation assumes that validation and deployment datasets are drawn from the same underlying distribution (IID). AETHEL extends this paradigm by auditing calibration explicitly under domain shift, quantifying ECE degradation across cohort transfer and automating post-hoc recalibration using both Platt scaling and Isotonic regression within the same reproducible pipeline. Niculescu-Mizil and Caruana (2005) demonstrated that tree-based models are systematically miscalibrated, a finding our results corroborate: Random Forest and XGBoost showed uncalibrated ECE of 0.162 and 0.203 respectively, reduced to 0.004 and 0.054 after Platt scaling. </w:t>
+        <w:br/>
+        <w:br/>
+        <w:t xml:space="preserve">In explainability, Lundberg and Lee (2017) introduced SHAP values as a unified framework for local model attribution. Adadi and Berrada (2018) and Arrieta et al. (2020) surveyed the broader XAI landscape, noting the gap between theoretical interpretability and clinical deployment. Doshi-Velez and Kim (2017) argued that interpretability must be evaluated rigorously, not assumed. AETHEL operationalises this argument by introducing the Feature Agreement Score (FAS) and Top-k Overlap (TkO) — quantitative metrics that assess whether SHAP attributions, permutation importance, and native feature importances agree under covariate shift, producing the first cross-cohort XAI stability audit embedded in a reproducible clinical pipeline. </w:t>
+        <w:br/>
+        <w:br/>
+        <w:t xml:space="preserve">For clinical utility, Steyerberg et al. (2010) and Van Calster et al. (2024) established Decision Curve Analysis (DCA) as the gold standard for evaluating Net Benefit across decision thresholds. Despite strong methodological advocacy, DCA remains rarely implemented at the bedside (Venn et al., 2008). AETHEL bridges this gap by projecting Net Benefit curves into 100-cell consequence waffle charts, translating abstract probability thresholds into absolute patient counts that clinical staff can interpret directly. </w:t>
+        <w:br/>
+        <w:br/>
+        <w:t>Regarding external validation, Collins et al. (2024) and Riley et al. (2021) define rigorous requirements for transportability of clinical prediction models, including minimum sample sizes and AUC precision bounds. Royston and Altman (2013) further demonstrated that internal validation routinely overestimates generalisability. AETHEL directly implements these guidelines: models are frozen after source training and evaluated unmodified on the Framingham target cohort, with bootstrap confidence intervals and AUC degradation explicitly reported. Lekadir et al. (2022) and the FUTURE-AI consortium (Ning et al., 2024) articulate a trustworthy AI roadmap for clinical systems; AETHEL provides a concrete executable instantiation of their principles. Collins et al. (TRIPOD+AI, 2024) and DECIDE-AI (2022) define reporting standards for AI-driven clinical decision support — AETHEL generates TRIPOD+AI-aligned audit reports automatically as part of its pipeline output.</w:t>
       </w:r>
       <w:proofErr w:type="spellStart"/>
-      <w:r>
-        <w:t>Steyerberg</w:t>
-      </w:r>
+      <w:r/>
       <w:proofErr w:type="spellEnd"/>
-      <w:r>
-        <w:t xml:space="preserve"> et al., 2010), bedside translation has been limited. AETHEL bridges this gap by projecting Net Benefit curves into 100-cell consequence waffle charts, translating abstract curves into absolute patient counts. Table 7 contrasts AETHEL with existing clinical AI validation frameworks.</w:t>
-      </w:r>
+      <w:r/>
     </w:p>
     <w:p>
       <w:pPr>

</xml_diff>